<commit_message>
Harden privacy boundary and correct evaluation claims
</commit_message>
<xml_diff>
--- a/docs/submission/pii-airlock-case-study.en.docx
+++ b/docs/submission/pii-airlock-case-study.en.docx
@@ -40,199 +40,111 @@
           <w:color w:val="5A626C"/>
           <w:sz w:val="28"/>
         </w:rPr>
-        <w:t>A local privacy gateway for cloud AI requests</w:t>
+        <w:t>Local pseudonymization before a cloud-model call</w:t>
       </w:r>
     </w:p>
-    <w:tbl>
-      <w:tblPr>
-        <w:tblW w:type="dxa" w:w="9360"/>
-        <w:jc w:val="left"/>
-        <w:tblLayout w:type="fixed"/>
-        <w:tblLook w:firstColumn="1" w:firstRow="1" w:lastColumn="0" w:lastRow="0" w:noHBand="0" w:noVBand="1" w:val="04A0"/>
-        <w:tblInd w:w="120" w:type="dxa"/>
-      </w:tblPr>
-      <w:tblGrid>
-        <w:gridCol w:w="1944"/>
-        <w:gridCol w:w="7416"/>
-      </w:tblGrid>
-      <w:tr>
-        <w:tc>
-          <w:tcPr>
-            <w:tcW w:type="dxa" w:w="1944"/>
-            <w:vAlign w:val="center"/>
-            <w:tcMar>
-              <w:top w:w="80" w:type="dxa"/>
-              <w:bottom w:w="80" w:type="dxa"/>
-              <w:start w:w="120" w:type="dxa"/>
-              <w:end w:w="120" w:type="dxa"/>
-            </w:tcMar>
-          </w:tcPr>
-          <w:p>
-            <w:r>
-              <w:rPr>
-                <w:rFonts w:ascii="Calibri" w:hAnsi="Calibri"/>
-                <w:b/>
-                <w:color w:val="5A626C"/>
-                <w:sz w:val="19"/>
-              </w:rPr>
-              <w:t>Author</w:t>
-            </w:r>
-          </w:p>
-        </w:tc>
-        <w:tc>
-          <w:tcPr>
-            <w:tcW w:type="dxa" w:w="7416"/>
-            <w:vAlign w:val="center"/>
-            <w:tcMar>
-              <w:top w:w="80" w:type="dxa"/>
-              <w:bottom w:w="80" w:type="dxa"/>
-              <w:start w:w="120" w:type="dxa"/>
-              <w:end w:w="120" w:type="dxa"/>
-            </w:tcMar>
-          </w:tcPr>
-          <w:p>
-            <w:r>
-              <w:rPr>
-                <w:rFonts w:ascii="Calibri" w:hAnsi="Calibri"/>
-                <w:b w:val="0"/>
-                <w:sz w:val="21"/>
-              </w:rPr>
-              <w:t>AI-Danil</w:t>
-            </w:r>
-          </w:p>
-        </w:tc>
-      </w:tr>
-      <w:tr>
-        <w:tc>
-          <w:tcPr>
-            <w:tcW w:type="dxa" w:w="1944"/>
-            <w:vAlign w:val="center"/>
-            <w:tcMar>
-              <w:top w:w="80" w:type="dxa"/>
-              <w:bottom w:w="80" w:type="dxa"/>
-              <w:start w:w="120" w:type="dxa"/>
-              <w:end w:w="120" w:type="dxa"/>
-            </w:tcMar>
-          </w:tcPr>
-          <w:p>
-            <w:r>
-              <w:rPr>
-                <w:rFonts w:ascii="Calibri" w:hAnsi="Calibri"/>
-                <w:b/>
-                <w:color w:val="5A626C"/>
-                <w:sz w:val="19"/>
-              </w:rPr>
-              <w:t>Date</w:t>
-            </w:r>
-          </w:p>
-        </w:tc>
-        <w:tc>
-          <w:tcPr>
-            <w:tcW w:type="dxa" w:w="7416"/>
-            <w:vAlign w:val="center"/>
-            <w:tcMar>
-              <w:top w:w="80" w:type="dxa"/>
-              <w:bottom w:w="80" w:type="dxa"/>
-              <w:start w:w="120" w:type="dxa"/>
-              <w:end w:w="120" w:type="dxa"/>
-            </w:tcMar>
-          </w:tcPr>
-          <w:p>
-            <w:r>
-              <w:rPr>
-                <w:rFonts w:ascii="Calibri" w:hAnsi="Calibri"/>
-                <w:b w:val="0"/>
-                <w:sz w:val="21"/>
-              </w:rPr>
-              <w:t>20 July 2026</w:t>
-            </w:r>
-          </w:p>
-        </w:tc>
-      </w:tr>
-      <w:tr>
-        <w:tc>
-          <w:tcPr>
-            <w:tcW w:type="dxa" w:w="1944"/>
-            <w:vAlign w:val="center"/>
-            <w:tcMar>
-              <w:top w:w="80" w:type="dxa"/>
-              <w:bottom w:w="80" w:type="dxa"/>
-              <w:start w:w="120" w:type="dxa"/>
-              <w:end w:w="120" w:type="dxa"/>
-            </w:tcMar>
-          </w:tcPr>
-          <w:p>
-            <w:r>
-              <w:rPr>
-                <w:rFonts w:ascii="Calibri" w:hAnsi="Calibri"/>
-                <w:b/>
-                <w:color w:val="5A626C"/>
-                <w:sz w:val="19"/>
-              </w:rPr>
-              <w:t>Status</w:t>
-            </w:r>
-          </w:p>
-        </w:tc>
-        <w:tc>
-          <w:tcPr>
-            <w:tcW w:type="dxa" w:w="7416"/>
-            <w:vAlign w:val="center"/>
-            <w:tcMar>
-              <w:top w:w="80" w:type="dxa"/>
-              <w:bottom w:w="80" w:type="dxa"/>
-              <w:start w:w="120" w:type="dxa"/>
-              <w:end w:w="120" w:type="dxa"/>
-            </w:tcMar>
-          </w:tcPr>
-          <w:p>
-            <w:r>
-              <w:rPr>
-                <w:rFonts w:ascii="Calibri" w:hAnsi="Calibri"/>
-                <w:b w:val="0"/>
-                <w:sz w:val="21"/>
-              </w:rPr>
-              <w:t>Reproducible public demonstrator</w:t>
-            </w:r>
-          </w:p>
-        </w:tc>
-      </w:tr>
-    </w:tbl>
-    <w:p/>
+    <w:p>
+      <w:pPr>
+        <w:spacing w:after="40"/>
+      </w:pPr>
+      <w:r>
+        <w:rPr>
+          <w:rFonts w:ascii="Calibri" w:hAnsi="Calibri"/>
+          <w:b/>
+          <w:color w:val="5A626C"/>
+          <w:sz w:val="19"/>
+        </w:rPr>
+        <w:t xml:space="preserve">Repository: </w:t>
+      </w:r>
+      <w:r>
+        <w:rPr>
+          <w:rFonts w:ascii="Calibri" w:hAnsi="Calibri"/>
+          <w:sz w:val="21"/>
+        </w:rPr>
+        <w:t>github.com/AI-Danil/pii-airlock</w:t>
+      </w:r>
+    </w:p>
+    <w:p>
+      <w:pPr>
+        <w:spacing w:after="40"/>
+      </w:pPr>
+      <w:r>
+        <w:rPr>
+          <w:rFonts w:ascii="Calibri" w:hAnsi="Calibri"/>
+          <w:b/>
+          <w:color w:val="5A626C"/>
+          <w:sz w:val="19"/>
+        </w:rPr>
+        <w:t xml:space="preserve">Run: </w:t>
+      </w:r>
+      <w:r>
+        <w:rPr>
+          <w:rFonts w:ascii="Calibri" w:hAnsi="Calibri"/>
+          <w:sz w:val="21"/>
+        </w:rPr>
+        <w:t>20 July 2026</w:t>
+      </w:r>
+    </w:p>
+    <w:p>
+      <w:pPr>
+        <w:spacing w:after="40"/>
+      </w:pPr>
+      <w:r>
+        <w:rPr>
+          <w:rFonts w:ascii="Calibri" w:hAnsi="Calibri"/>
+          <w:b/>
+          <w:color w:val="5A626C"/>
+          <w:sz w:val="19"/>
+        </w:rPr>
+        <w:t xml:space="preserve">Data: </w:t>
+      </w:r>
+      <w:r>
+        <w:rPr>
+          <w:rFonts w:ascii="Calibri" w:hAnsi="Calibri"/>
+          <w:sz w:val="21"/>
+        </w:rPr>
+        <w:t>30 synthetic documents</w:t>
+      </w:r>
+    </w:p>
+    <w:p>
+      <w:pPr>
+        <w:spacing w:after="40"/>
+      </w:pPr>
+    </w:p>
     <w:p>
       <w:pPr>
         <w:pStyle w:val="Heading1"/>
       </w:pPr>
       <w:r>
-        <w:t>Outcome first</w:t>
+        <w:t>1. Question and implementation</w:t>
+      </w:r>
+    </w:p>
+    <w:p>
+      <w:r>
+        <w:t>A personal assistant may send both instructions and a document to a provider. Either field can contain names, contacts, addresses, identifiers, or credentials. PII Airlock tests a local boundary: LM Studio proposes exact substrings; Python validates and replaces them; a rules-based scan checks the resulting fields; only current-operation tokens may be restored.</w:t>
       </w:r>
     </w:p>
     <w:p>
       <w:pPr>
-        <w:pBdr>
-          <w:bottom w:val="single" w:sz="10" w:color="2E74B5"/>
-        </w:pBdr>
+        <w:pStyle w:val="Heading2"/>
+      </w:pPr>
+      <w:r>
+        <w:t>What the status means</w:t>
+      </w:r>
+    </w:p>
+    <w:p>
+      <w:pPr>
+        <w:spacing w:after="160"/>
+        <w:shd w:fill="F2F4F7"/>
       </w:pPr>
       <w:r>
         <w:rPr>
           <w:rFonts w:ascii="Calibri" w:hAnsi="Calibri"/>
           <w:b/>
           <w:color w:val="1F4D78"/>
-          <w:sz w:val="22"/>
+          <w:sz w:val="21"/>
         </w:rPr>
-        <w:t>A working two-contour gateway now turns a document and task into a pseudonymized cloud payload, blocks unsafe cases, and restores only exact operation-scoped tokens. Cloud use is optional; the default is an inspectable dry-run. The project does not claim perfect anonymization.</w:t>
-      </w:r>
-    </w:p>
-    <w:p>
-      <w:pPr>
-        <w:pStyle w:val="Heading1"/>
-      </w:pPr>
-      <w:r>
-        <w:t>1. Problem and design decision</w:t>
-      </w:r>
-    </w:p>
-    <w:p>
-      <w:r>
-        <w:t>A personal AI assistant can benefit from a cloud model while its local context contains names, contacts, addresses, IDs, and credentials. A local LLM alone is not a security boundary: it can miss an entity, invent a substring, return invalid JSON, or follow an instruction embedded in the document. The design therefore combines a semantic detector with deterministic checks.</w:t>
+        <w:t>The interface uses READY_FOR_REVIEW. It means that the implemented deterministic checks found no residual value they recognize. It is not a determination that the document is safe. Cloud use remains off until an API key and model are set.</w:t>
       </w:r>
     </w:p>
     <w:p>
@@ -245,7 +157,7 @@
         <w:pStyle w:val="Heading1"/>
       </w:pPr>
       <w:r>
-        <w:t>2. Two-contour flow</w:t>
+        <w:t>2. Request path</w:t>
       </w:r>
     </w:p>
     <w:p>
@@ -259,7 +171,7 @@
           <w:rFonts w:ascii="Calibri" w:hAnsi="Calibri"/>
           <w:sz w:val="21"/>
         </w:rPr>
-        <w:t>LM Studio receives the task and document only through 127.0.0.1 and returns schema-constrained entity candidates.</w:t>
+        <w:t>The task and document are analysed together through LM Studio on 127.0.0.1.</w:t>
       </w:r>
     </w:p>
     <w:p>
@@ -273,7 +185,7 @@
           <w:rFonts w:ascii="Calibri" w:hAnsi="Calibri"/>
           <w:sz w:val="21"/>
         </w:rPr>
-        <w:t>Code accepts exact source substrings, resolves overlap longest-first, and emits __PII_&lt;nonce&gt;_&lt;TYPE&gt;_&lt;N&gt;__ tokens.</w:t>
+        <w:t>Only exact input substrings are accepted. Replacements run longest first and use a 128-bit operation nonce.</w:t>
       </w:r>
     </w:p>
     <w:p>
@@ -287,7 +199,7 @@
           <w:rFonts w:ascii="Calibri" w:hAnsi="Calibri"/>
           <w:sz w:val="21"/>
         </w:rPr>
-        <w:t>A residual gate checks the exact outgoing fields. Any model/schema error or known residual secret stops the request.</w:t>
+        <w:t>The API shows the same outbound instructions and input text later passed to the provider client.</w:t>
       </w:r>
     </w:p>
     <w:p>
@@ -301,7 +213,7 @@
           <w:rFonts w:ascii="Calibri" w:hAnsi="Calibri"/>
           <w:sz w:val="21"/>
         </w:rPr>
-        <w:t>OpenAI is optional. Without a key the exact payload is shown; with a key the Responses API is called with store: false.</w:t>
+        <w:t>A blocked, failed, completed, expired, or deleted operation loses its in-memory mapping.</w:t>
       </w:r>
     </w:p>
     <w:p>
@@ -315,15 +227,15 @@
           <w:rFonts w:ascii="Calibri" w:hAnsi="Calibri"/>
           <w:sz w:val="21"/>
         </w:rPr>
-        <w:t>The cloud response is untrusted. Unknown, altered, or forged tokens block restoration; the in-memory map is destroyed.</w:t>
+        <w:t>Any unknown, truncated, case-changed, or invented __PII_ fragment in the provider answer blocks restoration.</w:t>
       </w:r>
     </w:p>
     <w:p>
       <w:r>
         <w:drawing>
           <wp:inline xmlns:a="http://schemas.openxmlformats.org/drawingml/2006/main" xmlns:pic="http://schemas.openxmlformats.org/drawingml/2006/picture">
-            <wp:extent cx="5943600" cy="4086225"/>
-            <wp:docPr id="1" name="Picture 1"/>
+            <wp:extent cx="5943600" cy="3807288"/>
+            <wp:docPr id="1" name="Picture 1" descr="Web UI after a local dry-run · synthetic values only"/>
             <wp:cNvGraphicFramePr>
               <a:graphicFrameLocks noChangeAspect="1"/>
             </wp:cNvGraphicFramePr>
@@ -343,7 +255,7 @@
                   <pic:spPr>
                     <a:xfrm>
                       <a:off x="0" y="0"/>
-                      <a:ext cx="5943600" cy="4086225"/>
+                      <a:ext cx="5943600" cy="3807288"/>
                     </a:xfrm>
                     <a:prstGeom prst="rect"/>
                   </pic:spPr>
@@ -367,7 +279,7 @@
           <w:color w:val="5A626C"/>
           <w:sz w:val="17"/>
         </w:rPr>
-        <w:t>Real local Qwen dry-run · synthetic values only</w:t>
+        <w:t>Web UI after a local dry-run · synthetic values only</w:t>
       </w:r>
     </w:p>
     <w:p>
@@ -380,21 +292,22 @@
         <w:pStyle w:val="Heading1"/>
       </w:pPr>
       <w:r>
-        <w:t>3. Evidence, not promises</w:t>
+        <w:t>3. Published local-model run</w:t>
       </w:r>
     </w:p>
     <w:p>
       <w:r>
-        <w:t>All figures below come from the new reproducible run on 30 synthetic documents (15 Russian, 15 English).</w:t>
+        <w:t>The benchmark used 15 Russian and 15 English synthetic documents. It made no cloud calls.</w:t>
       </w:r>
     </w:p>
     <w:tbl>
       <w:tblPr>
         <w:tblStyle w:val="TableGrid"/>
         <w:tblW w:type="dxa" w:w="9360"/>
-        <w:jc w:val="left"/>
         <w:tblLayout w:type="fixed"/>
         <w:tblLook w:firstColumn="1" w:firstRow="1" w:lastColumn="0" w:lastRow="0" w:noHBand="0" w:noVBand="1" w:val="04A0"/>
+        <w:jc w:val="left"/>
+        <w:tblInd w:w="120" w:type="dxa"/>
         <w:tblInd w:w="120" w:type="dxa"/>
       </w:tblPr>
       <w:tblGrid>
@@ -403,6 +316,9 @@
         <w:gridCol w:w="2196"/>
       </w:tblGrid>
       <w:tr>
+        <w:trPr>
+          <w:tblHeader/>
+        </w:trPr>
         <w:tc>
           <w:tcPr>
             <w:tcW w:type="dxa" w:w="4968"/>
@@ -486,6 +402,7 @@
               <w:start w:w="120" w:type="dxa"/>
               <w:end w:w="120" w:type="dxa"/>
             </w:tcMar>
+            <w:vAlign w:val="center"/>
           </w:tcPr>
           <w:p>
             <w:r>
@@ -494,7 +411,7 @@
                 <w:b/>
                 <w:sz w:val="18"/>
               </w:rPr>
-              <w:t>Approved payloads / 30</w:t>
+              <w:t>Entity recall</w:t>
             </w:r>
           </w:p>
         </w:tc>
@@ -507,6 +424,7 @@
               <w:start w:w="120" w:type="dxa"/>
               <w:end w:w="120" w:type="dxa"/>
             </w:tcMar>
+            <w:vAlign w:val="center"/>
           </w:tcPr>
           <w:p>
             <w:r>
@@ -515,7 +433,7 @@
                 <w:b w:val="0"/>
                 <w:sz w:val="18"/>
               </w:rPr>
-              <w:t>25</w:t>
+              <w:t>0.7037</w:t>
             </w:r>
           </w:p>
         </w:tc>
@@ -528,6 +446,7 @@
               <w:start w:w="120" w:type="dxa"/>
               <w:end w:w="120" w:type="dxa"/>
             </w:tcMar>
+            <w:vAlign w:val="center"/>
           </w:tcPr>
           <w:p>
             <w:r>
@@ -536,7 +455,7 @@
                 <w:b w:val="0"/>
                 <w:sz w:val="18"/>
               </w:rPr>
-              <w:t>25</w:t>
+              <w:t>0.7593</w:t>
             </w:r>
           </w:p>
         </w:tc>
@@ -551,6 +470,7 @@
               <w:start w:w="120" w:type="dxa"/>
               <w:end w:w="120" w:type="dxa"/>
             </w:tcMar>
+            <w:vAlign w:val="center"/>
           </w:tcPr>
           <w:p>
             <w:r>
@@ -559,7 +479,7 @@
                 <w:b/>
                 <w:sz w:val="18"/>
               </w:rPr>
-              <w:t>Control leaks in approved payloads</w:t>
+              <w:t>Extra replacement values</w:t>
             </w:r>
           </w:p>
         </w:tc>
@@ -572,6 +492,7 @@
               <w:start w:w="120" w:type="dxa"/>
               <w:end w:w="120" w:type="dxa"/>
             </w:tcMar>
+            <w:vAlign w:val="center"/>
           </w:tcPr>
           <w:p>
             <w:r>
@@ -580,7 +501,7 @@
                 <w:b w:val="0"/>
                 <w:sz w:val="18"/>
               </w:rPr>
-              <w:t>0</w:t>
+              <w:t>5</w:t>
             </w:r>
           </w:p>
         </w:tc>
@@ -593,6 +514,75 @@
               <w:start w:w="120" w:type="dxa"/>
               <w:end w:w="120" w:type="dxa"/>
             </w:tcMar>
+            <w:vAlign w:val="center"/>
+          </w:tcPr>
+          <w:p>
+            <w:r>
+              <w:rPr>
+                <w:rFonts w:ascii="Calibri" w:hAnsi="Calibri"/>
+                <w:b w:val="0"/>
+                <w:sz w:val="18"/>
+              </w:rPr>
+              <w:t>4</w:t>
+            </w:r>
+          </w:p>
+        </w:tc>
+      </w:tr>
+      <w:tr>
+        <w:tc>
+          <w:tcPr>
+            <w:tcW w:type="dxa" w:w="4968"/>
+            <w:tcMar>
+              <w:top w:w="80" w:type="dxa"/>
+              <w:bottom w:w="80" w:type="dxa"/>
+              <w:start w:w="120" w:type="dxa"/>
+              <w:end w:w="120" w:type="dxa"/>
+            </w:tcMar>
+            <w:vAlign w:val="center"/>
+          </w:tcPr>
+          <w:p>
+            <w:r>
+              <w:rPr>
+                <w:rFonts w:ascii="Calibri" w:hAnsi="Calibri"/>
+                <w:b/>
+                <w:sz w:val="18"/>
+              </w:rPr>
+              <w:t>Detection failures</w:t>
+            </w:r>
+          </w:p>
+        </w:tc>
+        <w:tc>
+          <w:tcPr>
+            <w:tcW w:type="dxa" w:w="2196"/>
+            <w:tcMar>
+              <w:top w:w="80" w:type="dxa"/>
+              <w:bottom w:w="80" w:type="dxa"/>
+              <w:start w:w="120" w:type="dxa"/>
+              <w:end w:w="120" w:type="dxa"/>
+            </w:tcMar>
+            <w:vAlign w:val="center"/>
+          </w:tcPr>
+          <w:p>
+            <w:r>
+              <w:rPr>
+                <w:rFonts w:ascii="Calibri" w:hAnsi="Calibri"/>
+                <w:b w:val="0"/>
+                <w:sz w:val="18"/>
+              </w:rPr>
+              <w:t>4</w:t>
+            </w:r>
+          </w:p>
+        </w:tc>
+        <w:tc>
+          <w:tcPr>
+            <w:tcW w:type="dxa" w:w="2196"/>
+            <w:tcMar>
+              <w:top w:w="80" w:type="dxa"/>
+              <w:bottom w:w="80" w:type="dxa"/>
+              <w:start w:w="120" w:type="dxa"/>
+              <w:end w:w="120" w:type="dxa"/>
+            </w:tcMar>
+            <w:vAlign w:val="center"/>
           </w:tcPr>
           <w:p>
             <w:r>
@@ -616,6 +606,7 @@
               <w:start w:w="120" w:type="dxa"/>
               <w:end w:w="120" w:type="dxa"/>
             </w:tcMar>
+            <w:vAlign w:val="center"/>
           </w:tcPr>
           <w:p>
             <w:r>
@@ -624,7 +615,7 @@
                 <w:b/>
                 <w:sz w:val="18"/>
               </w:rPr>
-              <w:t>Entity-level recall</w:t>
+              <w:t>Runtime gate passes</w:t>
             </w:r>
           </w:p>
         </w:tc>
@@ -637,6 +628,7 @@
               <w:start w:w="120" w:type="dxa"/>
               <w:end w:w="120" w:type="dxa"/>
             </w:tcMar>
+            <w:vAlign w:val="center"/>
           </w:tcPr>
           <w:p>
             <w:r>
@@ -645,7 +637,7 @@
                 <w:b w:val="0"/>
                 <w:sz w:val="18"/>
               </w:rPr>
-              <w:t>0.6667</w:t>
+              <w:t>23</w:t>
             </w:r>
           </w:p>
         </w:tc>
@@ -658,6 +650,7 @@
               <w:start w:w="120" w:type="dxa"/>
               <w:end w:w="120" w:type="dxa"/>
             </w:tcMar>
+            <w:vAlign w:val="center"/>
           </w:tcPr>
           <w:p>
             <w:r>
@@ -666,7 +659,7 @@
                 <w:b w:val="0"/>
                 <w:sz w:val="18"/>
               </w:rPr>
-              <w:t>0.7593</w:t>
+              <w:t>26</w:t>
             </w:r>
           </w:p>
         </w:tc>
@@ -681,6 +674,7 @@
               <w:start w:w="120" w:type="dxa"/>
               <w:end w:w="120" w:type="dxa"/>
             </w:tcMar>
+            <w:vAlign w:val="center"/>
           </w:tcPr>
           <w:p>
             <w:r>
@@ -689,7 +683,7 @@
                 <w:b/>
                 <w:sz w:val="18"/>
               </w:rPr>
-              <w:t>Extra replacement values</w:t>
+              <w:t>Known-control leaks after runtime gate</w:t>
             </w:r>
           </w:p>
         </w:tc>
@@ -702,6 +696,7 @@
               <w:start w:w="120" w:type="dxa"/>
               <w:end w:w="120" w:type="dxa"/>
             </w:tcMar>
+            <w:vAlign w:val="center"/>
           </w:tcPr>
           <w:p>
             <w:r>
@@ -710,7 +705,7 @@
                 <w:b w:val="0"/>
                 <w:sz w:val="18"/>
               </w:rPr>
-              <w:t>5</w:t>
+              <w:t>0</w:t>
             </w:r>
           </w:p>
         </w:tc>
@@ -723,6 +718,7 @@
               <w:start w:w="120" w:type="dxa"/>
               <w:end w:w="120" w:type="dxa"/>
             </w:tcMar>
+            <w:vAlign w:val="center"/>
           </w:tcPr>
           <w:p>
             <w:r>
@@ -746,6 +742,7 @@
               <w:start w:w="120" w:type="dxa"/>
               <w:end w:w="120" w:type="dxa"/>
             </w:tcMar>
+            <w:vAlign w:val="center"/>
           </w:tcPr>
           <w:p>
             <w:r>
@@ -754,7 +751,7 @@
                 <w:b/>
                 <w:sz w:val="18"/>
               </w:rPr>
-              <w:t>Schema / exact-substring failures</w:t>
+              <w:t>Fixture-oracle passes</w:t>
             </w:r>
           </w:p>
         </w:tc>
@@ -767,6 +764,7 @@
               <w:start w:w="120" w:type="dxa"/>
               <w:end w:w="120" w:type="dxa"/>
             </w:tcMar>
+            <w:vAlign w:val="center"/>
           </w:tcPr>
           <w:p>
             <w:r>
@@ -775,7 +773,7 @@
                 <w:b w:val="0"/>
                 <w:sz w:val="18"/>
               </w:rPr>
-              <w:t>4</w:t>
+              <w:t>23</w:t>
             </w:r>
           </w:p>
         </w:tc>
@@ -788,6 +786,7 @@
               <w:start w:w="120" w:type="dxa"/>
               <w:end w:w="120" w:type="dxa"/>
             </w:tcMar>
+            <w:vAlign w:val="center"/>
           </w:tcPr>
           <w:p>
             <w:r>
@@ -796,7 +795,7 @@
                 <w:b w:val="0"/>
                 <w:sz w:val="18"/>
               </w:rPr>
-              <w:t>0</w:t>
+              <w:t>22</w:t>
             </w:r>
           </w:p>
         </w:tc>
@@ -811,6 +810,7 @@
               <w:start w:w="120" w:type="dxa"/>
               <w:end w:w="120" w:type="dxa"/>
             </w:tcMar>
+            <w:vAlign w:val="center"/>
           </w:tcPr>
           <w:p>
             <w:r>
@@ -819,7 +819,7 @@
                 <w:b/>
                 <w:sz w:val="18"/>
               </w:rPr>
-              <w:t>Dataset release blocks</w:t>
+              <w:t>Median latency</w:t>
             </w:r>
           </w:p>
         </w:tc>
@@ -832,6 +832,7 @@
               <w:start w:w="120" w:type="dxa"/>
               <w:end w:w="120" w:type="dxa"/>
             </w:tcMar>
+            <w:vAlign w:val="center"/>
           </w:tcPr>
           <w:p>
             <w:r>
@@ -840,7 +841,7 @@
                 <w:b w:val="0"/>
                 <w:sz w:val="18"/>
               </w:rPr>
-              <w:t>1</w:t>
+              <w:t>1.948 s</w:t>
             </w:r>
           </w:p>
         </w:tc>
@@ -853,6 +854,7 @@
               <w:start w:w="120" w:type="dxa"/>
               <w:end w:w="120" w:type="dxa"/>
             </w:tcMar>
+            <w:vAlign w:val="center"/>
           </w:tcPr>
           <w:p>
             <w:r>
@@ -861,7 +863,7 @@
                 <w:b w:val="0"/>
                 <w:sz w:val="18"/>
               </w:rPr>
-              <w:t>5</w:t>
+              <w:t>1.014 s</w:t>
             </w:r>
           </w:p>
         </w:tc>
@@ -876,6 +878,7 @@
               <w:start w:w="120" w:type="dxa"/>
               <w:end w:w="120" w:type="dxa"/>
             </w:tcMar>
+            <w:vAlign w:val="center"/>
           </w:tcPr>
           <w:p>
             <w:r>
@@ -884,7 +887,7 @@
                 <w:b/>
                 <w:sz w:val="18"/>
               </w:rPr>
-              <w:t>Round-trip fidelity cases</w:t>
+              <w:t>Maximum latency</w:t>
             </w:r>
           </w:p>
         </w:tc>
@@ -897,6 +900,7 @@
               <w:start w:w="120" w:type="dxa"/>
               <w:end w:w="120" w:type="dxa"/>
             </w:tcMar>
+            <w:vAlign w:val="center"/>
           </w:tcPr>
           <w:p>
             <w:r>
@@ -905,7 +909,7 @@
                 <w:b w:val="0"/>
                 <w:sz w:val="18"/>
               </w:rPr>
-              <w:t>26</w:t>
+              <w:t>4.152 s</w:t>
             </w:r>
           </w:p>
         </w:tc>
@@ -918,6 +922,7 @@
               <w:start w:w="120" w:type="dxa"/>
               <w:end w:w="120" w:type="dxa"/>
             </w:tcMar>
+            <w:vAlign w:val="center"/>
           </w:tcPr>
           <w:p>
             <w:r>
@@ -926,78 +931,16 @@
                 <w:b w:val="0"/>
                 <w:sz w:val="18"/>
               </w:rPr>
-              <w:t>30</w:t>
-            </w:r>
-          </w:p>
-        </w:tc>
-      </w:tr>
-      <w:tr>
-        <w:tc>
-          <w:tcPr>
-            <w:tcW w:type="dxa" w:w="4968"/>
-            <w:tcMar>
-              <w:top w:w="80" w:type="dxa"/>
-              <w:bottom w:w="80" w:type="dxa"/>
-              <w:start w:w="120" w:type="dxa"/>
-              <w:end w:w="120" w:type="dxa"/>
-            </w:tcMar>
-          </w:tcPr>
-          <w:p>
-            <w:r>
-              <w:rPr>
-                <w:rFonts w:ascii="Calibri" w:hAnsi="Calibri"/>
-                <w:b/>
-                <w:sz w:val="18"/>
-              </w:rPr>
-              <w:t>Median / maximum</w:t>
-            </w:r>
-          </w:p>
-        </w:tc>
-        <w:tc>
-          <w:tcPr>
-            <w:tcW w:type="dxa" w:w="2196"/>
-            <w:tcMar>
-              <w:top w:w="80" w:type="dxa"/>
-              <w:bottom w:w="80" w:type="dxa"/>
-              <w:start w:w="120" w:type="dxa"/>
-              <w:end w:w="120" w:type="dxa"/>
-            </w:tcMar>
-          </w:tcPr>
-          <w:p>
-            <w:r>
-              <w:rPr>
-                <w:rFonts w:ascii="Calibri" w:hAnsi="Calibri"/>
-                <w:b w:val="0"/>
-                <w:sz w:val="18"/>
-              </w:rPr>
-              <w:t>2.556 / 6.182 s</w:t>
-            </w:r>
-          </w:p>
-        </w:tc>
-        <w:tc>
-          <w:tcPr>
-            <w:tcW w:type="dxa" w:w="2196"/>
-            <w:tcMar>
-              <w:top w:w="80" w:type="dxa"/>
-              <w:bottom w:w="80" w:type="dxa"/>
-              <w:start w:w="120" w:type="dxa"/>
-              <w:end w:w="120" w:type="dxa"/>
-            </w:tcMar>
-          </w:tcPr>
-          <w:p>
-            <w:r>
-              <w:rPr>
-                <w:rFonts w:ascii="Calibri" w:hAnsi="Calibri"/>
-                <w:b w:val="0"/>
-                <w:sz w:val="18"/>
-              </w:rPr>
-              <w:t>1.567 / 4.116 s</w:t>
+              <w:t>15.628 s</w:t>
             </w:r>
           </w:p>
         </w:tc>
       </w:tr>
     </w:tbl>
     <w:p>
+      <w:pPr>
+        <w:spacing w:before="120"/>
+      </w:pPr>
       <w:r>
         <w:rPr>
           <w:rFonts w:ascii="Calibri" w:hAnsi="Calibri"/>
@@ -1006,7 +949,7 @@
           <w:color w:val="5A626C"/>
           <w:sz w:val="20"/>
         </w:rPr>
-        <w:t>Interpretation: both models remain experimental. The dataset-only oracle withheld any payload still containing a known control value. Zero approved-payload leaks is bounded evidence for these fixtures—not proof for unseen documents.</w:t>
+        <w:t>The runtime gate caught the labelled Qwen controls in this run but missed four Gemma cases. The fixture oracle stopped them because it knew the expected values; that oracle is unavailable for arbitrary documents. Qwen's four failures were non-exact substrings. Neither model produced invalid JSON/schema output in this run.</w:t>
       </w:r>
     </w:p>
     <w:p>
@@ -1014,7 +957,7 @@
         <w:pStyle w:val="Heading1"/>
       </w:pPr>
       <w:r>
-        <w:t>4. Delivered artifacts</w:t>
+        <w:t>4. Files and checks</w:t>
       </w:r>
     </w:p>
     <w:p>
@@ -1028,7 +971,7 @@
           <w:rFonts w:ascii="Calibri" w:hAnsi="Calibri"/>
           <w:sz w:val="21"/>
         </w:rPr>
-        <w:t>Python 3.11 Web UI, CLI, and local API with a 10-minute in-memory mapping TTL.</w:t>
+        <w:t>Web UI, CLI, and five local API routes; provider calls are optional and dry-run is the default.</w:t>
       </w:r>
     </w:p>
     <w:p>
@@ -1042,7 +985,7 @@
           <w:rFonts w:ascii="Calibri" w:hAnsi="Calibri"/>
           <w:sz w:val="21"/>
         </w:rPr>
-        <w:t>TXT, Markdown, DOCX, and text-layer PDF parsing; OCR/images/archives and &gt;20,000 characters blocked in V1.</w:t>
+        <w:t>TXT, Markdown, DOCX, and text-layer PDF input with upload, expansion, page, and character limits.</w:t>
       </w:r>
     </w:p>
     <w:p>
@@ -1056,7 +999,7 @@
           <w:rFonts w:ascii="Calibri" w:hAnsi="Calibri"/>
           <w:sz w:val="21"/>
         </w:rPr>
-        <w:t>25 offline tests with stubs: span validation, overlap, tokens, TTL, formats, timeout, prompt-injection framing, logs, and round trip.</w:t>
+        <w:t>52 offline tests plus ruff and compile checks; CI uses stubs and no model or provider credentials.</w:t>
       </w:r>
     </w:p>
     <w:p>
@@ -1070,7 +1013,7 @@
           <w:rFonts w:ascii="Calibri" w:hAnsi="Calibri"/>
           <w:sz w:val="21"/>
         </w:rPr>
-        <w:t>Full English/Russian README, threat model, SECURITY.md, synthetic fixtures, per-case JSON, screenshot, and GitHub Actions.</w:t>
+        <w:t>English and Russian README, architecture, security limits, per-case JSON, screenshot, DOCX, and PDF.</w:t>
       </w:r>
     </w:p>
     <w:p>
@@ -1084,7 +1027,7 @@
           <w:rFonts w:ascii="Calibri" w:hAnsi="Calibri"/>
           <w:sz w:val="21"/>
         </w:rPr>
-        <w:t>A local, disabled Gosha adapter with fail-closed behavior; 27/27 current Gosha tests passed and no service was restarted.</w:t>
+        <w:t>A separate Gosha adapter exists locally behind a disabled feature flag and fails closed on gateway errors.</w:t>
       </w:r>
     </w:p>
     <w:p>
@@ -1092,12 +1035,12 @@
         <w:pStyle w:val="Heading1"/>
       </w:pPr>
       <w:r>
-        <w:t>5. Risks and next experiment</w:t>
+        <w:t>5. Decision</w:t>
       </w:r>
     </w:p>
     <w:p>
       <w:r>
-        <w:t>Semantic PII can still be missed; rules are not universal DLP. Process memory, LM Studio internals, OS swap, and provider policy are outside the guarantee. High-risk use requires dry-run review. The next useful experiment is a larger adversarial fixture set plus improved semantic detection without weakening exact-substring validation.</w:t>
+        <w:t>Use the project as a demonstrator and dry-run inspection tool. Do not use READY_FOR_REVIEW as automatic authorization for high-risk documents. The Gosha flag remains off. A next version needs an independently evaluated detector and an explicit policy for the stateless API.</w:t>
       </w:r>
     </w:p>
     <w:sectPr>
@@ -1125,7 +1068,7 @@
         <w:color w:val="5A626C"/>
         <w:sz w:val="17"/>
       </w:rPr>
-      <w:t>AI-Danil  ·  2026  ·  Synthetic evidence only</w:t>
+      <w:t>Synthetic evaluation · 20 July 2026</w:t>
     </w:r>
   </w:p>
 </w:ftr>
@@ -1136,7 +1079,6 @@
   <w:p>
     <w:pPr>
       <w:pStyle w:val="Header"/>
-      <w:jc w:val="left"/>
     </w:pPr>
     <w:r>
       <w:rPr>

</xml_diff>

<commit_message>
Harden operation lifecycle and local API
</commit_message>
<xml_diff>
--- a/docs/submission/pii-airlock-case-study.en.docx
+++ b/docs/submission/pii-airlock-case-study.en.docx
@@ -82,7 +82,7 @@
           <w:rFonts w:ascii="Calibri" w:hAnsi="Calibri"/>
           <w:sz w:val="21"/>
         </w:rPr>
-        <w:t>20 July 2026</w:t>
+        <w:t>21 July 2026</w:t>
       </w:r>
     </w:p>
     <w:p>
@@ -185,7 +185,7 @@
           <w:rFonts w:ascii="Calibri" w:hAnsi="Calibri"/>
           <w:sz w:val="21"/>
         </w:rPr>
-        <w:t>Only exact input substrings are accepted. Replacements run longest first and use a 128-bit operation nonce.</w:t>
+        <w:t>Exact spans are selected longest first. Only replaced values enter the mapping; tokens use a 128-bit operation nonce.</w:t>
       </w:r>
     </w:p>
     <w:p>
@@ -213,7 +213,21 @@
           <w:rFonts w:ascii="Calibri" w:hAnsi="Calibri"/>
           <w:sz w:val="21"/>
         </w:rPr>
-        <w:t>A blocked, failed, completed, expired, or deleted operation loses its in-memory mapping.</w:t>
+        <w:t>Completion is claimed once. One active sweeper removes expired mappings; the pending store is capped at 100.</w:t>
+      </w:r>
+    </w:p>
+    <w:p>
+      <w:pPr>
+        <w:pStyle w:val="ListBullet"/>
+        <w:spacing w:after="100" w:line="280" w:lineRule="auto"/>
+        <w:ind w:left="720" w:hanging="360"/>
+      </w:pPr>
+      <w:r>
+        <w:rPr>
+          <w:rFonts w:ascii="Calibri" w:hAnsi="Calibri"/>
+          <w:sz w:val="21"/>
+        </w:rPr>
+        <w:t>Browser writes require an HttpOnly session and same origin. The stateless route requires a bearer token.</w:t>
       </w:r>
     </w:p>
     <w:p>
@@ -234,7 +248,7 @@
       <w:r>
         <w:drawing>
           <wp:inline xmlns:a="http://schemas.openxmlformats.org/drawingml/2006/main" xmlns:pic="http://schemas.openxmlformats.org/drawingml/2006/picture">
-            <wp:extent cx="5943600" cy="3807288"/>
+            <wp:extent cx="5943600" cy="5324475"/>
             <wp:docPr id="1" name="Picture 1" descr="Web UI after a local dry-run · synthetic values only"/>
             <wp:cNvGraphicFramePr>
               <a:graphicFrameLocks noChangeAspect="1"/>
@@ -255,7 +269,7 @@
                   <pic:spPr>
                     <a:xfrm>
                       <a:off x="0" y="0"/>
-                      <a:ext cx="5943600" cy="3807288"/>
+                      <a:ext cx="5943600" cy="5324475"/>
                     </a:xfrm>
                     <a:prstGeom prst="rect"/>
                   </pic:spPr>
@@ -841,7 +855,7 @@
                 <w:b w:val="0"/>
                 <w:sz w:val="18"/>
               </w:rPr>
-              <w:t>1.948 s</w:t>
+              <w:t>2.617 s</w:t>
             </w:r>
           </w:p>
         </w:tc>
@@ -863,7 +877,7 @@
                 <w:b w:val="0"/>
                 <w:sz w:val="18"/>
               </w:rPr>
-              <w:t>1.014 s</w:t>
+              <w:t>1.355 s</w:t>
             </w:r>
           </w:p>
         </w:tc>
@@ -909,7 +923,7 @@
                 <w:b w:val="0"/>
                 <w:sz w:val="18"/>
               </w:rPr>
-              <w:t>4.152 s</w:t>
+              <w:t>16.903 s</w:t>
             </w:r>
           </w:p>
         </w:tc>
@@ -931,7 +945,7 @@
                 <w:b w:val="0"/>
                 <w:sz w:val="18"/>
               </w:rPr>
-              <w:t>15.628 s</w:t>
+              <w:t>18.933 s</w:t>
             </w:r>
           </w:p>
         </w:tc>
@@ -971,7 +985,7 @@
           <w:rFonts w:ascii="Calibri" w:hAnsi="Calibri"/>
           <w:sz w:val="21"/>
         </w:rPr>
-        <w:t>Web UI, CLI, and five local API routes; provider calls are optional and dry-run is the default.</w:t>
+        <w:t>Web UI, CLI, and six versioned API routes; provider calls are optional and dry-run is the default.</w:t>
       </w:r>
     </w:p>
     <w:p>
@@ -999,7 +1013,7 @@
           <w:rFonts w:ascii="Calibri" w:hAnsi="Calibri"/>
           <w:sz w:val="21"/>
         </w:rPr>
-        <w:t>52 offline tests plus ruff and compile checks; CI uses stubs and no model or provider credentials.</w:t>
+        <w:t>64 offline tests plus ruff, compile, and a clean Python 3.11 install; CI targets Python 3.11 and 3.12.</w:t>
       </w:r>
     </w:p>
     <w:p>
@@ -1040,7 +1054,7 @@
     </w:p>
     <w:p>
       <w:r>
-        <w:t>Use the project as a demonstrator and dry-run inspection tool. Do not use READY_FOR_REVIEW as automatic authorization for high-risk documents. The Gosha flag remains off. A next version needs an independently evaluated detector and an explicit policy for the stateless API.</w:t>
+        <w:t>Use the project as a demonstrator and dry-run inspection tool. Do not use READY_FOR_REVIEW as automatic authorization for high-risk documents. The Gosha flag remains off. The next separate iteration should address recall with detector ensembles, manual span correction, a larger synthetic set, and per-type metrics.</w:t>
       </w:r>
     </w:p>
     <w:sectPr>
@@ -1068,7 +1082,7 @@
         <w:color w:val="5A626C"/>
         <w:sz w:val="17"/>
       </w:rPr>
-      <w:t>Synthetic evaluation · 20 July 2026</w:t>
+      <w:t>Synthetic evaluation · 21 July 2026</w:t>
     </w:r>
   </w:p>
 </w:ftr>

</xml_diff>

<commit_message>
Harden privacy gateway and publish expanded evidence
</commit_message>
<xml_diff>
--- a/docs/submission/pii-airlock-case-study.en.docx
+++ b/docs/submission/pii-airlock-case-study.en.docx
@@ -103,7 +103,7 @@
           <w:rFonts w:ascii="Calibri" w:hAnsi="Calibri"/>
           <w:sz w:val="21"/>
         </w:rPr>
-        <w:t>30 synthetic documents</w:t>
+        <w:t>52 synthetic documents</w:t>
       </w:r>
     </w:p>
     <w:p>
@@ -121,7 +121,7 @@
     </w:p>
     <w:p>
       <w:r>
-        <w:t>A personal assistant may send both instructions and a document to a provider. Either field can contain names, contacts, addresses, identifiers, or credentials. PII Airlock tests a local boundary: LM Studio proposes exact substrings; Python validates and replaces them; a rules-based scan checks the resulting fields; only current-operation tokens may be restored.</w:t>
+        <w:t>A personal assistant may send both instructions and a document to a provider. Either field can contain names, contacts, addresses, identifiers, or credentials. PII Airlock tests a local boundary: deterministic rules and LM Studio propose source spans; Python validates and replaces them; a second scan checks the result; only current-operation tokens may be restored.</w:t>
       </w:r>
     </w:p>
     <w:p>
@@ -163,69 +163,69 @@
     <w:p>
       <w:pPr>
         <w:pStyle w:val="ListBullet"/>
-        <w:spacing w:after="100" w:line="280" w:lineRule="auto"/>
+        <w:spacing w:after="60" w:line="259" w:lineRule="auto"/>
         <w:ind w:left="720" w:hanging="360"/>
       </w:pPr>
       <w:r>
         <w:rPr>
           <w:rFonts w:ascii="Calibri" w:hAnsi="Calibri"/>
-          <w:sz w:val="21"/>
+          <w:sz w:val="20"/>
         </w:rPr>
-        <w:t>The task and document are analysed together through LM Studio on 127.0.0.1.</w:t>
+        <w:t>Rules map selected Unicode and zero-width obfuscations back to exact source offsets; LM Studio adds semantic candidates.</w:t>
       </w:r>
     </w:p>
     <w:p>
       <w:pPr>
         <w:pStyle w:val="ListBullet"/>
-        <w:spacing w:after="100" w:line="280" w:lineRule="auto"/>
+        <w:spacing w:after="60" w:line="259" w:lineRule="auto"/>
         <w:ind w:left="720" w:hanging="360"/>
       </w:pPr>
       <w:r>
         <w:rPr>
           <w:rFonts w:ascii="Calibri" w:hAnsi="Calibri"/>
-          <w:sz w:val="21"/>
+          <w:sz w:val="20"/>
         </w:rPr>
-        <w:t>Exact spans are selected longest first. Only replaced values enter the mapping; tokens use a 128-bit operation nonce.</w:t>
+        <w:t>The reviewer can add, remove, or retag exact spans. Source hashes prevent edits against a changed document.</w:t>
       </w:r>
     </w:p>
     <w:p>
       <w:pPr>
         <w:pStyle w:val="ListBullet"/>
-        <w:spacing w:after="100" w:line="280" w:lineRule="auto"/>
+        <w:spacing w:after="60" w:line="259" w:lineRule="auto"/>
         <w:ind w:left="720" w:hanging="360"/>
       </w:pPr>
       <w:r>
         <w:rPr>
           <w:rFonts w:ascii="Calibri" w:hAnsi="Calibri"/>
-          <w:sz w:val="21"/>
+          <w:sz w:val="20"/>
         </w:rPr>
-        <w:t>The API shows the same outbound instructions and input text later passed to the provider client.</w:t>
+        <w:t>The API shows the same delimited, untrusted outbound fields later passed to the provider client.</w:t>
       </w:r>
     </w:p>
     <w:p>
       <w:pPr>
         <w:pStyle w:val="ListBullet"/>
-        <w:spacing w:after="100" w:line="280" w:lineRule="auto"/>
+        <w:spacing w:after="60" w:line="259" w:lineRule="auto"/>
         <w:ind w:left="720" w:hanging="360"/>
       </w:pPr>
       <w:r>
         <w:rPr>
           <w:rFonts w:ascii="Calibri" w:hAnsi="Calibri"/>
-          <w:sz w:val="21"/>
+          <w:sz w:val="20"/>
         </w:rPr>
-        <w:t>Completion is claimed once. One active sweeper removes expired mappings; the pending store is capped at 100.</w:t>
+        <w:t>Completion is claimed at most once. One sweeper removes expired mappings; the pending store is capped at 100.</w:t>
       </w:r>
     </w:p>
     <w:p>
       <w:pPr>
         <w:pStyle w:val="ListBullet"/>
-        <w:spacing w:after="100" w:line="280" w:lineRule="auto"/>
+        <w:spacing w:after="60" w:line="259" w:lineRule="auto"/>
         <w:ind w:left="720" w:hanging="360"/>
       </w:pPr>
       <w:r>
         <w:rPr>
           <w:rFonts w:ascii="Calibri" w:hAnsi="Calibri"/>
-          <w:sz w:val="21"/>
+          <w:sz w:val="20"/>
         </w:rPr>
         <w:t>Browser writes require an HttpOnly session and same origin. The stateless route requires a bearer token.</w:t>
       </w:r>
@@ -233,22 +233,25 @@
     <w:p>
       <w:pPr>
         <w:pStyle w:val="ListBullet"/>
-        <w:spacing w:after="100" w:line="280" w:lineRule="auto"/>
+        <w:spacing w:after="60" w:line="259" w:lineRule="auto"/>
         <w:ind w:left="720" w:hanging="360"/>
       </w:pPr>
       <w:r>
         <w:rPr>
           <w:rFonts w:ascii="Calibri" w:hAnsi="Calibri"/>
-          <w:sz w:val="21"/>
+          <w:sz w:val="20"/>
         </w:rPr>
-        <w:t>Any unknown, truncated, case-changed, or invented __PII_ fragment in the provider answer blocks restoration.</w:t>
+        <w:t>Unknown, truncated, case-changed, invented, or over-repeated __PII_ fragments block restoration.</w:t>
       </w:r>
     </w:p>
     <w:p>
+      <w:pPr>
+        <w:jc w:val="center"/>
+      </w:pPr>
       <w:r>
         <w:drawing>
           <wp:inline xmlns:a="http://schemas.openxmlformats.org/drawingml/2006/main" xmlns:pic="http://schemas.openxmlformats.org/drawingml/2006/picture">
-            <wp:extent cx="5943600" cy="5324475"/>
+            <wp:extent cx="4297680" cy="5231082"/>
             <wp:docPr id="1" name="Picture 1" descr="Web UI after a local dry-run · synthetic values only"/>
             <wp:cNvGraphicFramePr>
               <a:graphicFrameLocks noChangeAspect="1"/>
@@ -269,7 +272,7 @@
                   <pic:spPr>
                     <a:xfrm>
                       <a:off x="0" y="0"/>
-                      <a:ext cx="5943600" cy="5324475"/>
+                      <a:ext cx="4297680" cy="5231082"/>
                     </a:xfrm>
                     <a:prstGeom prst="rect"/>
                   </pic:spPr>
@@ -311,7 +314,7 @@
     </w:p>
     <w:p>
       <w:r>
-        <w:t>The benchmark used 15 Russian and 15 English synthetic documents. It made no cloud calls.</w:t>
+        <w:t>The benchmark used 26 Russian and 26 English synthetic documents. Six were clean controls and 20 were tagged adversarial. It made no cloud calls.</w:t>
       </w:r>
     </w:p>
     <w:tbl>
@@ -338,10 +341,10 @@
             <w:tcW w:type="dxa" w:w="4968"/>
             <w:vAlign w:val="center"/>
             <w:tcMar>
-              <w:top w:w="80" w:type="dxa"/>
-              <w:bottom w:w="80" w:type="dxa"/>
-              <w:start w:w="120" w:type="dxa"/>
-              <w:end w:w="120" w:type="dxa"/>
+              <w:top w:w="55" w:type="dxa"/>
+              <w:bottom w:w="55" w:type="dxa"/>
+              <w:start w:w="100" w:type="dxa"/>
+              <w:end w:w="100" w:type="dxa"/>
             </w:tcMar>
             <w:shd w:fill="F2F4F7"/>
           </w:tcPr>
@@ -351,7 +354,7 @@
                 <w:rFonts w:ascii="Calibri" w:hAnsi="Calibri"/>
                 <w:b/>
                 <w:color w:val="1F4D78"/>
-                <w:sz w:val="19"/>
+                <w:sz w:val="18"/>
               </w:rPr>
               <w:t>Metric</w:t>
             </w:r>
@@ -362,10 +365,10 @@
             <w:tcW w:type="dxa" w:w="2196"/>
             <w:vAlign w:val="center"/>
             <w:tcMar>
-              <w:top w:w="80" w:type="dxa"/>
-              <w:bottom w:w="80" w:type="dxa"/>
-              <w:start w:w="120" w:type="dxa"/>
-              <w:end w:w="120" w:type="dxa"/>
+              <w:top w:w="55" w:type="dxa"/>
+              <w:bottom w:w="55" w:type="dxa"/>
+              <w:start w:w="100" w:type="dxa"/>
+              <w:end w:w="100" w:type="dxa"/>
             </w:tcMar>
             <w:shd w:fill="F2F4F7"/>
           </w:tcPr>
@@ -375,7 +378,7 @@
                 <w:rFonts w:ascii="Calibri" w:hAnsi="Calibri"/>
                 <w:b/>
                 <w:color w:val="1F4D78"/>
-                <w:sz w:val="19"/>
+                <w:sz w:val="18"/>
               </w:rPr>
               <w:t>Qwen 3.5 9B</w:t>
             </w:r>
@@ -386,10 +389,10 @@
             <w:tcW w:type="dxa" w:w="2196"/>
             <w:vAlign w:val="center"/>
             <w:tcMar>
-              <w:top w:w="80" w:type="dxa"/>
-              <w:bottom w:w="80" w:type="dxa"/>
-              <w:start w:w="120" w:type="dxa"/>
-              <w:end w:w="120" w:type="dxa"/>
+              <w:top w:w="55" w:type="dxa"/>
+              <w:bottom w:w="55" w:type="dxa"/>
+              <w:start w:w="100" w:type="dxa"/>
+              <w:end w:w="100" w:type="dxa"/>
             </w:tcMar>
             <w:shd w:fill="F2F4F7"/>
           </w:tcPr>
@@ -399,7 +402,7 @@
                 <w:rFonts w:ascii="Calibri" w:hAnsi="Calibri"/>
                 <w:b/>
                 <w:color w:val="1F4D78"/>
-                <w:sz w:val="19"/>
+                <w:sz w:val="18"/>
               </w:rPr>
               <w:t>Gemma 4 E4B</w:t>
             </w:r>
@@ -411,10 +414,10 @@
           <w:tcPr>
             <w:tcW w:type="dxa" w:w="4968"/>
             <w:tcMar>
-              <w:top w:w="80" w:type="dxa"/>
-              <w:bottom w:w="80" w:type="dxa"/>
-              <w:start w:w="120" w:type="dxa"/>
-              <w:end w:w="120" w:type="dxa"/>
+              <w:top w:w="55" w:type="dxa"/>
+              <w:bottom w:w="55" w:type="dxa"/>
+              <w:start w:w="100" w:type="dxa"/>
+              <w:end w:w="100" w:type="dxa"/>
             </w:tcMar>
             <w:vAlign w:val="center"/>
           </w:tcPr>
@@ -423,7 +426,7 @@
               <w:rPr>
                 <w:rFonts w:ascii="Calibri" w:hAnsi="Calibri"/>
                 <w:b/>
-                <w:sz w:val="18"/>
+                <w:sz w:val="17"/>
               </w:rPr>
               <w:t>Entity recall</w:t>
             </w:r>
@@ -433,10 +436,10 @@
           <w:tcPr>
             <w:tcW w:type="dxa" w:w="2196"/>
             <w:tcMar>
-              <w:top w:w="80" w:type="dxa"/>
-              <w:bottom w:w="80" w:type="dxa"/>
-              <w:start w:w="120" w:type="dxa"/>
-              <w:end w:w="120" w:type="dxa"/>
+              <w:top w:w="55" w:type="dxa"/>
+              <w:bottom w:w="55" w:type="dxa"/>
+              <w:start w:w="100" w:type="dxa"/>
+              <w:end w:w="100" w:type="dxa"/>
             </w:tcMar>
             <w:vAlign w:val="center"/>
           </w:tcPr>
@@ -445,9 +448,9 @@
               <w:rPr>
                 <w:rFonts w:ascii="Calibri" w:hAnsi="Calibri"/>
                 <w:b w:val="0"/>
-                <w:sz w:val="18"/>
+                <w:sz w:val="17"/>
               </w:rPr>
-              <w:t>0.7037</w:t>
+              <w:t>0.8472</w:t>
             </w:r>
           </w:p>
         </w:tc>
@@ -455,10 +458,10 @@
           <w:tcPr>
             <w:tcW w:type="dxa" w:w="2196"/>
             <w:tcMar>
-              <w:top w:w="80" w:type="dxa"/>
-              <w:bottom w:w="80" w:type="dxa"/>
-              <w:start w:w="120" w:type="dxa"/>
-              <w:end w:w="120" w:type="dxa"/>
+              <w:top w:w="55" w:type="dxa"/>
+              <w:bottom w:w="55" w:type="dxa"/>
+              <w:start w:w="100" w:type="dxa"/>
+              <w:end w:w="100" w:type="dxa"/>
             </w:tcMar>
             <w:vAlign w:val="center"/>
           </w:tcPr>
@@ -467,9 +470,9 @@
               <w:rPr>
                 <w:rFonts w:ascii="Calibri" w:hAnsi="Calibri"/>
                 <w:b w:val="0"/>
-                <w:sz w:val="18"/>
+                <w:sz w:val="17"/>
               </w:rPr>
-              <w:t>0.7593</w:t>
+              <w:t>0.8056</w:t>
             </w:r>
           </w:p>
         </w:tc>
@@ -479,10 +482,10 @@
           <w:tcPr>
             <w:tcW w:type="dxa" w:w="4968"/>
             <w:tcMar>
-              <w:top w:w="80" w:type="dxa"/>
-              <w:bottom w:w="80" w:type="dxa"/>
-              <w:start w:w="120" w:type="dxa"/>
-              <w:end w:w="120" w:type="dxa"/>
+              <w:top w:w="55" w:type="dxa"/>
+              <w:bottom w:w="55" w:type="dxa"/>
+              <w:start w:w="100" w:type="dxa"/>
+              <w:end w:w="100" w:type="dxa"/>
             </w:tcMar>
             <w:vAlign w:val="center"/>
           </w:tcPr>
@@ -491,9 +494,9 @@
               <w:rPr>
                 <w:rFonts w:ascii="Calibri" w:hAnsi="Calibri"/>
                 <w:b/>
-                <w:sz w:val="18"/>
+                <w:sz w:val="17"/>
               </w:rPr>
-              <w:t>Extra replacement values</w:t>
+              <w:t>Entity precision</w:t>
             </w:r>
           </w:p>
         </w:tc>
@@ -501,10 +504,10 @@
           <w:tcPr>
             <w:tcW w:type="dxa" w:w="2196"/>
             <w:tcMar>
-              <w:top w:w="80" w:type="dxa"/>
-              <w:bottom w:w="80" w:type="dxa"/>
-              <w:start w:w="120" w:type="dxa"/>
-              <w:end w:w="120" w:type="dxa"/>
+              <w:top w:w="55" w:type="dxa"/>
+              <w:bottom w:w="55" w:type="dxa"/>
+              <w:start w:w="100" w:type="dxa"/>
+              <w:end w:w="100" w:type="dxa"/>
             </w:tcMar>
             <w:vAlign w:val="center"/>
           </w:tcPr>
@@ -513,9 +516,9 @@
               <w:rPr>
                 <w:rFonts w:ascii="Calibri" w:hAnsi="Calibri"/>
                 <w:b w:val="0"/>
-                <w:sz w:val="18"/>
+                <w:sz w:val="17"/>
               </w:rPr>
-              <w:t>5</w:t>
+              <w:t>0.8243</w:t>
             </w:r>
           </w:p>
         </w:tc>
@@ -523,10 +526,10 @@
           <w:tcPr>
             <w:tcW w:type="dxa" w:w="2196"/>
             <w:tcMar>
-              <w:top w:w="80" w:type="dxa"/>
-              <w:bottom w:w="80" w:type="dxa"/>
-              <w:start w:w="120" w:type="dxa"/>
-              <w:end w:w="120" w:type="dxa"/>
+              <w:top w:w="55" w:type="dxa"/>
+              <w:bottom w:w="55" w:type="dxa"/>
+              <w:start w:w="100" w:type="dxa"/>
+              <w:end w:w="100" w:type="dxa"/>
             </w:tcMar>
             <w:vAlign w:val="center"/>
           </w:tcPr>
@@ -535,9 +538,9 @@
               <w:rPr>
                 <w:rFonts w:ascii="Calibri" w:hAnsi="Calibri"/>
                 <w:b w:val="0"/>
-                <w:sz w:val="18"/>
+                <w:sz w:val="17"/>
               </w:rPr>
-              <w:t>4</w:t>
+              <w:t>0.9062</w:t>
             </w:r>
           </w:p>
         </w:tc>
@@ -547,10 +550,10 @@
           <w:tcPr>
             <w:tcW w:type="dxa" w:w="4968"/>
             <w:tcMar>
-              <w:top w:w="80" w:type="dxa"/>
-              <w:bottom w:w="80" w:type="dxa"/>
-              <w:start w:w="120" w:type="dxa"/>
-              <w:end w:w="120" w:type="dxa"/>
+              <w:top w:w="55" w:type="dxa"/>
+              <w:bottom w:w="55" w:type="dxa"/>
+              <w:start w:w="100" w:type="dxa"/>
+              <w:end w:w="100" w:type="dxa"/>
             </w:tcMar>
             <w:vAlign w:val="center"/>
           </w:tcPr>
@@ -559,7 +562,7 @@
               <w:rPr>
                 <w:rFonts w:ascii="Calibri" w:hAnsi="Calibri"/>
                 <w:b/>
-                <w:sz w:val="18"/>
+                <w:sz w:val="17"/>
               </w:rPr>
               <w:t>Detection failures</w:t>
             </w:r>
@@ -569,10 +572,10 @@
           <w:tcPr>
             <w:tcW w:type="dxa" w:w="2196"/>
             <w:tcMar>
-              <w:top w:w="80" w:type="dxa"/>
-              <w:bottom w:w="80" w:type="dxa"/>
-              <w:start w:w="120" w:type="dxa"/>
-              <w:end w:w="120" w:type="dxa"/>
+              <w:top w:w="55" w:type="dxa"/>
+              <w:bottom w:w="55" w:type="dxa"/>
+              <w:start w:w="100" w:type="dxa"/>
+              <w:end w:w="100" w:type="dxa"/>
             </w:tcMar>
             <w:vAlign w:val="center"/>
           </w:tcPr>
@@ -581,9 +584,9 @@
               <w:rPr>
                 <w:rFonts w:ascii="Calibri" w:hAnsi="Calibri"/>
                 <w:b w:val="0"/>
-                <w:sz w:val="18"/>
+                <w:sz w:val="17"/>
               </w:rPr>
-              <w:t>4</w:t>
+              <w:t>11</w:t>
             </w:r>
           </w:p>
         </w:tc>
@@ -591,10 +594,10 @@
           <w:tcPr>
             <w:tcW w:type="dxa" w:w="2196"/>
             <w:tcMar>
-              <w:top w:w="80" w:type="dxa"/>
-              <w:bottom w:w="80" w:type="dxa"/>
-              <w:start w:w="120" w:type="dxa"/>
-              <w:end w:w="120" w:type="dxa"/>
+              <w:top w:w="55" w:type="dxa"/>
+              <w:bottom w:w="55" w:type="dxa"/>
+              <w:start w:w="100" w:type="dxa"/>
+              <w:end w:w="100" w:type="dxa"/>
             </w:tcMar>
             <w:vAlign w:val="center"/>
           </w:tcPr>
@@ -603,7 +606,7 @@
               <w:rPr>
                 <w:rFonts w:ascii="Calibri" w:hAnsi="Calibri"/>
                 <w:b w:val="0"/>
-                <w:sz w:val="18"/>
+                <w:sz w:val="17"/>
               </w:rPr>
               <w:t>0</w:t>
             </w:r>
@@ -615,10 +618,10 @@
           <w:tcPr>
             <w:tcW w:type="dxa" w:w="4968"/>
             <w:tcMar>
-              <w:top w:w="80" w:type="dxa"/>
-              <w:bottom w:w="80" w:type="dxa"/>
-              <w:start w:w="120" w:type="dxa"/>
-              <w:end w:w="120" w:type="dxa"/>
+              <w:top w:w="55" w:type="dxa"/>
+              <w:bottom w:w="55" w:type="dxa"/>
+              <w:start w:w="100" w:type="dxa"/>
+              <w:end w:w="100" w:type="dxa"/>
             </w:tcMar>
             <w:vAlign w:val="center"/>
           </w:tcPr>
@@ -627,7 +630,7 @@
               <w:rPr>
                 <w:rFonts w:ascii="Calibri" w:hAnsi="Calibri"/>
                 <w:b/>
-                <w:sz w:val="18"/>
+                <w:sz w:val="17"/>
               </w:rPr>
               <w:t>Runtime gate passes</w:t>
             </w:r>
@@ -637,10 +640,10 @@
           <w:tcPr>
             <w:tcW w:type="dxa" w:w="2196"/>
             <w:tcMar>
-              <w:top w:w="80" w:type="dxa"/>
-              <w:bottom w:w="80" w:type="dxa"/>
-              <w:start w:w="120" w:type="dxa"/>
-              <w:end w:w="120" w:type="dxa"/>
+              <w:top w:w="55" w:type="dxa"/>
+              <w:bottom w:w="55" w:type="dxa"/>
+              <w:start w:w="100" w:type="dxa"/>
+              <w:end w:w="100" w:type="dxa"/>
             </w:tcMar>
             <w:vAlign w:val="center"/>
           </w:tcPr>
@@ -649,9 +652,9 @@
               <w:rPr>
                 <w:rFonts w:ascii="Calibri" w:hAnsi="Calibri"/>
                 <w:b w:val="0"/>
-                <w:sz w:val="18"/>
+                <w:sz w:val="17"/>
               </w:rPr>
-              <w:t>23</w:t>
+              <w:t>32</w:t>
             </w:r>
           </w:p>
         </w:tc>
@@ -659,10 +662,10 @@
           <w:tcPr>
             <w:tcW w:type="dxa" w:w="2196"/>
             <w:tcMar>
-              <w:top w:w="80" w:type="dxa"/>
-              <w:bottom w:w="80" w:type="dxa"/>
-              <w:start w:w="120" w:type="dxa"/>
-              <w:end w:w="120" w:type="dxa"/>
+              <w:top w:w="55" w:type="dxa"/>
+              <w:bottom w:w="55" w:type="dxa"/>
+              <w:start w:w="100" w:type="dxa"/>
+              <w:end w:w="100" w:type="dxa"/>
             </w:tcMar>
             <w:vAlign w:val="center"/>
           </w:tcPr>
@@ -671,9 +674,9 @@
               <w:rPr>
                 <w:rFonts w:ascii="Calibri" w:hAnsi="Calibri"/>
                 <w:b w:val="0"/>
-                <w:sz w:val="18"/>
+                <w:sz w:val="17"/>
               </w:rPr>
-              <w:t>26</w:t>
+              <w:t>42</w:t>
             </w:r>
           </w:p>
         </w:tc>
@@ -683,10 +686,10 @@
           <w:tcPr>
             <w:tcW w:type="dxa" w:w="4968"/>
             <w:tcMar>
-              <w:top w:w="80" w:type="dxa"/>
-              <w:bottom w:w="80" w:type="dxa"/>
-              <w:start w:w="120" w:type="dxa"/>
-              <w:end w:w="120" w:type="dxa"/>
+              <w:top w:w="55" w:type="dxa"/>
+              <w:bottom w:w="55" w:type="dxa"/>
+              <w:start w:w="100" w:type="dxa"/>
+              <w:end w:w="100" w:type="dxa"/>
             </w:tcMar>
             <w:vAlign w:val="center"/>
           </w:tcPr>
@@ -695,7 +698,7 @@
               <w:rPr>
                 <w:rFonts w:ascii="Calibri" w:hAnsi="Calibri"/>
                 <w:b/>
-                <w:sz w:val="18"/>
+                <w:sz w:val="17"/>
               </w:rPr>
               <w:t>Known-control leaks after runtime gate</w:t>
             </w:r>
@@ -705,10 +708,10 @@
           <w:tcPr>
             <w:tcW w:type="dxa" w:w="2196"/>
             <w:tcMar>
-              <w:top w:w="80" w:type="dxa"/>
-              <w:bottom w:w="80" w:type="dxa"/>
-              <w:start w:w="120" w:type="dxa"/>
-              <w:end w:w="120" w:type="dxa"/>
+              <w:top w:w="55" w:type="dxa"/>
+              <w:bottom w:w="55" w:type="dxa"/>
+              <w:start w:w="100" w:type="dxa"/>
+              <w:end w:w="100" w:type="dxa"/>
             </w:tcMar>
             <w:vAlign w:val="center"/>
           </w:tcPr>
@@ -717,7 +720,7 @@
               <w:rPr>
                 <w:rFonts w:ascii="Calibri" w:hAnsi="Calibri"/>
                 <w:b w:val="0"/>
-                <w:sz w:val="18"/>
+                <w:sz w:val="17"/>
               </w:rPr>
               <w:t>0</w:t>
             </w:r>
@@ -727,10 +730,10 @@
           <w:tcPr>
             <w:tcW w:type="dxa" w:w="2196"/>
             <w:tcMar>
-              <w:top w:w="80" w:type="dxa"/>
-              <w:bottom w:w="80" w:type="dxa"/>
-              <w:start w:w="120" w:type="dxa"/>
-              <w:end w:w="120" w:type="dxa"/>
+              <w:top w:w="55" w:type="dxa"/>
+              <w:bottom w:w="55" w:type="dxa"/>
+              <w:start w:w="100" w:type="dxa"/>
+              <w:end w:w="100" w:type="dxa"/>
             </w:tcMar>
             <w:vAlign w:val="center"/>
           </w:tcPr>
@@ -739,9 +742,9 @@
               <w:rPr>
                 <w:rFonts w:ascii="Calibri" w:hAnsi="Calibri"/>
                 <w:b w:val="0"/>
-                <w:sz w:val="18"/>
+                <w:sz w:val="17"/>
               </w:rPr>
-              <w:t>4</w:t>
+              <w:t>9</w:t>
             </w:r>
           </w:p>
         </w:tc>
@@ -751,10 +754,10 @@
           <w:tcPr>
             <w:tcW w:type="dxa" w:w="4968"/>
             <w:tcMar>
-              <w:top w:w="80" w:type="dxa"/>
-              <w:bottom w:w="80" w:type="dxa"/>
-              <w:start w:w="120" w:type="dxa"/>
-              <w:end w:w="120" w:type="dxa"/>
+              <w:top w:w="55" w:type="dxa"/>
+              <w:bottom w:w="55" w:type="dxa"/>
+              <w:start w:w="100" w:type="dxa"/>
+              <w:end w:w="100" w:type="dxa"/>
             </w:tcMar>
             <w:vAlign w:val="center"/>
           </w:tcPr>
@@ -763,9 +766,9 @@
               <w:rPr>
                 <w:rFonts w:ascii="Calibri" w:hAnsi="Calibri"/>
                 <w:b/>
-                <w:sz w:val="18"/>
+                <w:sz w:val="17"/>
               </w:rPr>
-              <w:t>Fixture-oracle passes</w:t>
+              <w:t>Fixture-assisted review projection</w:t>
             </w:r>
           </w:p>
         </w:tc>
@@ -773,10 +776,10 @@
           <w:tcPr>
             <w:tcW w:type="dxa" w:w="2196"/>
             <w:tcMar>
-              <w:top w:w="80" w:type="dxa"/>
-              <w:bottom w:w="80" w:type="dxa"/>
-              <w:start w:w="120" w:type="dxa"/>
-              <w:end w:w="120" w:type="dxa"/>
+              <w:top w:w="55" w:type="dxa"/>
+              <w:bottom w:w="55" w:type="dxa"/>
+              <w:start w:w="100" w:type="dxa"/>
+              <w:end w:w="100" w:type="dxa"/>
             </w:tcMar>
             <w:vAlign w:val="center"/>
           </w:tcPr>
@@ -785,9 +788,9 @@
               <w:rPr>
                 <w:rFonts w:ascii="Calibri" w:hAnsi="Calibri"/>
                 <w:b w:val="0"/>
-                <w:sz w:val="18"/>
+                <w:sz w:val="17"/>
               </w:rPr>
-              <w:t>23</w:t>
+              <w:t>42</w:t>
             </w:r>
           </w:p>
         </w:tc>
@@ -795,10 +798,10 @@
           <w:tcPr>
             <w:tcW w:type="dxa" w:w="2196"/>
             <w:tcMar>
-              <w:top w:w="80" w:type="dxa"/>
-              <w:bottom w:w="80" w:type="dxa"/>
-              <w:start w:w="120" w:type="dxa"/>
-              <w:end w:w="120" w:type="dxa"/>
+              <w:top w:w="55" w:type="dxa"/>
+              <w:bottom w:w="55" w:type="dxa"/>
+              <w:start w:w="100" w:type="dxa"/>
+              <w:end w:w="100" w:type="dxa"/>
             </w:tcMar>
             <w:vAlign w:val="center"/>
           </w:tcPr>
@@ -807,9 +810,9 @@
               <w:rPr>
                 <w:rFonts w:ascii="Calibri" w:hAnsi="Calibri"/>
                 <w:b w:val="0"/>
-                <w:sz w:val="18"/>
+                <w:sz w:val="17"/>
               </w:rPr>
-              <w:t>22</w:t>
+              <w:t>42</w:t>
             </w:r>
           </w:p>
         </w:tc>
@@ -819,10 +822,10 @@
           <w:tcPr>
             <w:tcW w:type="dxa" w:w="4968"/>
             <w:tcMar>
-              <w:top w:w="80" w:type="dxa"/>
-              <w:bottom w:w="80" w:type="dxa"/>
-              <w:start w:w="120" w:type="dxa"/>
-              <w:end w:w="120" w:type="dxa"/>
+              <w:top w:w="55" w:type="dxa"/>
+              <w:bottom w:w="55" w:type="dxa"/>
+              <w:start w:w="100" w:type="dxa"/>
+              <w:end w:w="100" w:type="dxa"/>
             </w:tcMar>
             <w:vAlign w:val="center"/>
           </w:tcPr>
@@ -831,7 +834,7 @@
               <w:rPr>
                 <w:rFonts w:ascii="Calibri" w:hAnsi="Calibri"/>
                 <w:b/>
-                <w:sz w:val="18"/>
+                <w:sz w:val="17"/>
               </w:rPr>
               <w:t>Median latency</w:t>
             </w:r>
@@ -841,10 +844,10 @@
           <w:tcPr>
             <w:tcW w:type="dxa" w:w="2196"/>
             <w:tcMar>
-              <w:top w:w="80" w:type="dxa"/>
-              <w:bottom w:w="80" w:type="dxa"/>
-              <w:start w:w="120" w:type="dxa"/>
-              <w:end w:w="120" w:type="dxa"/>
+              <w:top w:w="55" w:type="dxa"/>
+              <w:bottom w:w="55" w:type="dxa"/>
+              <w:start w:w="100" w:type="dxa"/>
+              <w:end w:w="100" w:type="dxa"/>
             </w:tcMar>
             <w:vAlign w:val="center"/>
           </w:tcPr>
@@ -853,9 +856,9 @@
               <w:rPr>
                 <w:rFonts w:ascii="Calibri" w:hAnsi="Calibri"/>
                 <w:b w:val="0"/>
-                <w:sz w:val="18"/>
+                <w:sz w:val="17"/>
               </w:rPr>
-              <w:t>2.617 s</w:t>
+              <w:t>11.053 s</w:t>
             </w:r>
           </w:p>
         </w:tc>
@@ -863,10 +866,10 @@
           <w:tcPr>
             <w:tcW w:type="dxa" w:w="2196"/>
             <w:tcMar>
-              <w:top w:w="80" w:type="dxa"/>
-              <w:bottom w:w="80" w:type="dxa"/>
-              <w:start w:w="120" w:type="dxa"/>
-              <w:end w:w="120" w:type="dxa"/>
+              <w:top w:w="55" w:type="dxa"/>
+              <w:bottom w:w="55" w:type="dxa"/>
+              <w:start w:w="100" w:type="dxa"/>
+              <w:end w:w="100" w:type="dxa"/>
             </w:tcMar>
             <w:vAlign w:val="center"/>
           </w:tcPr>
@@ -875,9 +878,9 @@
               <w:rPr>
                 <w:rFonts w:ascii="Calibri" w:hAnsi="Calibri"/>
                 <w:b w:val="0"/>
-                <w:sz w:val="18"/>
+                <w:sz w:val="17"/>
               </w:rPr>
-              <w:t>1.355 s</w:t>
+              <w:t>2.799 s</w:t>
             </w:r>
           </w:p>
         </w:tc>
@@ -887,10 +890,10 @@
           <w:tcPr>
             <w:tcW w:type="dxa" w:w="4968"/>
             <w:tcMar>
-              <w:top w:w="80" w:type="dxa"/>
-              <w:bottom w:w="80" w:type="dxa"/>
-              <w:start w:w="120" w:type="dxa"/>
-              <w:end w:w="120" w:type="dxa"/>
+              <w:top w:w="55" w:type="dxa"/>
+              <w:bottom w:w="55" w:type="dxa"/>
+              <w:start w:w="100" w:type="dxa"/>
+              <w:end w:w="100" w:type="dxa"/>
             </w:tcMar>
             <w:vAlign w:val="center"/>
           </w:tcPr>
@@ -899,7 +902,7 @@
               <w:rPr>
                 <w:rFonts w:ascii="Calibri" w:hAnsi="Calibri"/>
                 <w:b/>
-                <w:sz w:val="18"/>
+                <w:sz w:val="17"/>
               </w:rPr>
               <w:t>Maximum latency</w:t>
             </w:r>
@@ -909,10 +912,10 @@
           <w:tcPr>
             <w:tcW w:type="dxa" w:w="2196"/>
             <w:tcMar>
-              <w:top w:w="80" w:type="dxa"/>
-              <w:bottom w:w="80" w:type="dxa"/>
-              <w:start w:w="120" w:type="dxa"/>
-              <w:end w:w="120" w:type="dxa"/>
+              <w:top w:w="55" w:type="dxa"/>
+              <w:bottom w:w="55" w:type="dxa"/>
+              <w:start w:w="100" w:type="dxa"/>
+              <w:end w:w="100" w:type="dxa"/>
             </w:tcMar>
             <w:vAlign w:val="center"/>
           </w:tcPr>
@@ -921,9 +924,9 @@
               <w:rPr>
                 <w:rFonts w:ascii="Calibri" w:hAnsi="Calibri"/>
                 <w:b w:val="0"/>
-                <w:sz w:val="18"/>
+                <w:sz w:val="17"/>
               </w:rPr>
-              <w:t>16.903 s</w:t>
+              <w:t>20.86 s</w:t>
             </w:r>
           </w:p>
         </w:tc>
@@ -931,10 +934,10 @@
           <w:tcPr>
             <w:tcW w:type="dxa" w:w="2196"/>
             <w:tcMar>
-              <w:top w:w="80" w:type="dxa"/>
-              <w:bottom w:w="80" w:type="dxa"/>
-              <w:start w:w="120" w:type="dxa"/>
-              <w:end w:w="120" w:type="dxa"/>
+              <w:top w:w="55" w:type="dxa"/>
+              <w:bottom w:w="55" w:type="dxa"/>
+              <w:start w:w="100" w:type="dxa"/>
+              <w:end w:w="100" w:type="dxa"/>
             </w:tcMar>
             <w:vAlign w:val="center"/>
           </w:tcPr>
@@ -943,9 +946,9 @@
               <w:rPr>
                 <w:rFonts w:ascii="Calibri" w:hAnsi="Calibri"/>
                 <w:b w:val="0"/>
-                <w:sz w:val="18"/>
+                <w:sz w:val="17"/>
               </w:rPr>
-              <w:t>18.933 s</w:t>
+              <w:t>14.254 s</w:t>
             </w:r>
           </w:p>
         </w:tc>
@@ -961,9 +964,9 @@
           <w:b w:val="0"/>
           <w:i/>
           <w:color w:val="5A626C"/>
-          <w:sz w:val="20"/>
+          <w:sz w:val="19"/>
         </w:rPr>
-        <w:t>The runtime gate caught the labelled Qwen controls in this run but missed four Gemma cases. The fixture oracle stopped them because it knew the expected values; that oracle is unavailable for arbitrary documents. Qwen's four failures were non-exact substrings. Neither model produced invalid JSON/schema output in this run.</w:t>
+        <w:t>Qwen produced 11 non-exact semantic proposals; deterministic findings remained available for review, but automatic completion stayed blocked. Gemma allowed 9 labelled values past the runtime gate. The fixture oracle stopped them because it knew the answers; arbitrary documents have no such oracle. The review projection applies fixture labels and is not a measured human-review result.</w:t>
       </w:r>
     </w:p>
     <w:p>
@@ -977,55 +980,69 @@
     <w:p>
       <w:pPr>
         <w:pStyle w:val="ListBullet"/>
-        <w:spacing w:after="100" w:line="280" w:lineRule="auto"/>
+        <w:spacing w:after="60" w:line="259" w:lineRule="auto"/>
         <w:ind w:left="720" w:hanging="360"/>
       </w:pPr>
       <w:r>
         <w:rPr>
           <w:rFonts w:ascii="Calibri" w:hAnsi="Calibri"/>
-          <w:sz w:val="21"/>
+          <w:sz w:val="20"/>
         </w:rPr>
-        <w:t>Web UI, CLI, and six versioned API routes; provider calls are optional and dry-run is the default.</w:t>
+        <w:t>Web UI, CLI, and versioned API routes, including source-bound manual span review; dry-run is the default.</w:t>
       </w:r>
     </w:p>
     <w:p>
       <w:pPr>
         <w:pStyle w:val="ListBullet"/>
-        <w:spacing w:after="100" w:line="280" w:lineRule="auto"/>
+        <w:spacing w:after="60" w:line="259" w:lineRule="auto"/>
         <w:ind w:left="720" w:hanging="360"/>
       </w:pPr>
       <w:r>
         <w:rPr>
           <w:rFonts w:ascii="Calibri" w:hAnsi="Calibri"/>
-          <w:sz w:val="21"/>
+          <w:sz w:val="20"/>
         </w:rPr>
-        <w:t>TXT, Markdown, DOCX, and text-layer PDF input with upload, expansion, page, and character limits.</w:t>
+        <w:t>TXT, Markdown, DOCX, and text-layer PDF input; DOCX/PDF parsing runs in bounded child processes.</w:t>
       </w:r>
     </w:p>
     <w:p>
       <w:pPr>
         <w:pStyle w:val="ListBullet"/>
-        <w:spacing w:after="100" w:line="280" w:lineRule="auto"/>
+        <w:spacing w:after="60" w:line="259" w:lineRule="auto"/>
         <w:ind w:left="720" w:hanging="360"/>
       </w:pPr>
       <w:r>
         <w:rPr>
           <w:rFonts w:ascii="Calibri" w:hAnsi="Calibri"/>
-          <w:sz w:val="21"/>
+          <w:sz w:val="20"/>
         </w:rPr>
-        <w:t>64 offline tests plus ruff, compile, and a clean Python 3.11 install; CI targets Python 3.11 and 3.12.</w:t>
+        <w:t>88 offline tests plus ruff, compile, and clean Python 3.11/3.12 installs.</w:t>
       </w:r>
     </w:p>
     <w:p>
       <w:pPr>
         <w:pStyle w:val="ListBullet"/>
-        <w:spacing w:after="100" w:line="280" w:lineRule="auto"/>
+        <w:spacing w:after="60" w:line="259" w:lineRule="auto"/>
         <w:ind w:left="720" w:hanging="360"/>
       </w:pPr>
       <w:r>
         <w:rPr>
           <w:rFonts w:ascii="Calibri" w:hAnsi="Calibri"/>
-          <w:sz w:val="21"/>
+          <w:sz w:val="20"/>
+        </w:rPr>
+        <w:t>Exact dependency locks, secret scan, dependency audit, CycloneDX SBOM, and tagged-build attestation workflow.</w:t>
+      </w:r>
+    </w:p>
+    <w:p>
+      <w:pPr>
+        <w:pStyle w:val="ListBullet"/>
+        <w:spacing w:after="60" w:line="259" w:lineRule="auto"/>
+        <w:ind w:left="720" w:hanging="360"/>
+      </w:pPr>
+      <w:r>
+        <w:rPr>
+          <w:rFonts w:ascii="Calibri" w:hAnsi="Calibri"/>
+          <w:sz w:val="20"/>
         </w:rPr>
         <w:t>English and Russian README, architecture, security limits, per-case JSON, screenshot, DOCX, and PDF.</w:t>
       </w:r>
@@ -1033,13 +1050,13 @@
     <w:p>
       <w:pPr>
         <w:pStyle w:val="ListBullet"/>
-        <w:spacing w:after="100" w:line="280" w:lineRule="auto"/>
+        <w:spacing w:after="60" w:line="259" w:lineRule="auto"/>
         <w:ind w:left="720" w:hanging="360"/>
       </w:pPr>
       <w:r>
         <w:rPr>
           <w:rFonts w:ascii="Calibri" w:hAnsi="Calibri"/>
-          <w:sz w:val="21"/>
+          <w:sz w:val="20"/>
         </w:rPr>
         <w:t>A separate Gosha adapter exists locally behind a disabled feature flag and fails closed on gateway errors.</w:t>
       </w:r>
@@ -1054,14 +1071,14 @@
     </w:p>
     <w:p>
       <w:r>
-        <w:t>Use the project as a demonstrator and dry-run inspection tool. Do not use READY_FOR_REVIEW as automatic authorization for high-risk documents. The Gosha flag remains off. The next separate iteration should address recall with detector ensembles, manual span correction, a larger synthetic set, and per-type metrics.</w:t>
+        <w:t>Use the project as a demonstrator and dry-run inspection tool. Do not use READY_FOR_REVIEW as automatic authorization for high-risk documents. The Gosha flag remains off. The next evidence should come from independent human review on a versioned synthetic set and explicit acceptance thresholds.</w:t>
       </w:r>
     </w:p>
     <w:sectPr>
       <w:headerReference w:type="default" r:id="rId9"/>
       <w:footerReference w:type="default" r:id="rId10"/>
       <w:pgSz w:w="12240" w:h="15840"/>
-      <w:pgMar w:top="1440" w:right="1440" w:bottom="1440" w:left="1440" w:header="708" w:footer="708" w:gutter="0"/>
+      <w:pgMar w:top="1080" w:right="1440" w:bottom="1080" w:left="1440" w:header="708" w:footer="708" w:gutter="0"/>
       <w:cols w:space="720"/>
       <w:docGrid w:linePitch="360"/>
     </w:sectPr>

</xml_diff>

<commit_message>
feat: harden privacy gateway evidence and isolation
</commit_message>
<xml_diff>
--- a/docs/submission/pii-airlock-case-study.en.docx
+++ b/docs/submission/pii-airlock-case-study.en.docx
@@ -199,6 +199,20 @@
           <w:rFonts w:ascii="Calibri" w:hAnsi="Calibri"/>
           <w:sz w:val="20"/>
         </w:rPr>
+        <w:t>Opaque mode gives every occurrence a different placeholder, hiding both entity type and repeated-value linkage.</w:t>
+      </w:r>
+    </w:p>
+    <w:p>
+      <w:pPr>
+        <w:pStyle w:val="ListBullet"/>
+        <w:spacing w:after="60" w:line="259" w:lineRule="auto"/>
+        <w:ind w:left="720" w:hanging="360"/>
+      </w:pPr>
+      <w:r>
+        <w:rPr>
+          <w:rFonts w:ascii="Calibri" w:hAnsi="Calibri"/>
+          <w:sz w:val="20"/>
+        </w:rPr>
         <w:t>The API shows the same delimited, untrusted outbound fields later passed to the provider client.</w:t>
       </w:r>
     </w:p>
@@ -241,7 +255,7 @@
           <w:rFonts w:ascii="Calibri" w:hAnsi="Calibri"/>
           <w:sz w:val="20"/>
         </w:rPr>
-        <w:t>Unknown, truncated, case-changed, invented, or over-repeated __PII_ fragments block restoration.</w:t>
+        <w:t>Unknown, truncated, case-changed, invented, or over-repeated __PII_ fragments block restoration; completed output stays tainted.</w:t>
       </w:r>
     </w:p>
     <w:p>
@@ -251,7 +265,7 @@
       <w:r>
         <w:drawing>
           <wp:inline xmlns:a="http://schemas.openxmlformats.org/drawingml/2006/main" xmlns:pic="http://schemas.openxmlformats.org/drawingml/2006/picture">
-            <wp:extent cx="4297680" cy="5231082"/>
+            <wp:extent cx="2743200" cy="3347561"/>
             <wp:docPr id="1" name="Picture 1" descr="Web UI after a local dry-run · synthetic values only"/>
             <wp:cNvGraphicFramePr>
               <a:graphicFrameLocks noChangeAspect="1"/>
@@ -272,7 +286,7 @@
                   <pic:spPr>
                     <a:xfrm>
                       <a:off x="0" y="0"/>
-                      <a:ext cx="4297680" cy="5231082"/>
+                      <a:ext cx="2743200" cy="3347561"/>
                     </a:xfrm>
                     <a:prstGeom prst="rect"/>
                   </pic:spPr>
@@ -1002,7 +1016,7 @@
           <w:rFonts w:ascii="Calibri" w:hAnsi="Calibri"/>
           <w:sz w:val="20"/>
         </w:rPr>
-        <w:t>TXT, Markdown, DOCX, and text-layer PDF input; DOCX/PDF parsing runs in bounded child processes.</w:t>
+        <w:t>TXT, Markdown, DOCX, and text-layer PDF input; parsers return completeness manifests and run in bounded child processes.</w:t>
       </w:r>
     </w:p>
     <w:p>
@@ -1016,7 +1030,7 @@
           <w:rFonts w:ascii="Calibri" w:hAnsi="Calibri"/>
           <w:sz w:val="20"/>
         </w:rPr>
-        <w:t>88 offline tests plus ruff, compile, and clean Python 3.11/3.12 installs.</w:t>
+        <w:t>96 offline tests plus ruff, compile, and clean hash-locked Python 3.11/3.12 installs.</w:t>
       </w:r>
     </w:p>
     <w:p>
@@ -1030,7 +1044,35 @@
           <w:rFonts w:ascii="Calibri" w:hAnsi="Calibri"/>
           <w:sz w:val="20"/>
         </w:rPr>
-        <w:t>Exact dependency locks, secret scan, dependency audit, CycloneDX SBOM, and tagged-build attestation workflow.</w:t>
+        <w:t>Exact dependency locks, secret scan, vulnerability audit, CycloneDX SBOM, and tagged-build attestation workflow.</w:t>
+      </w:r>
+    </w:p>
+    <w:p>
+      <w:pPr>
+        <w:pStyle w:val="ListBullet"/>
+        <w:spacing w:after="60" w:line="259" w:lineRule="auto"/>
+        <w:ind w:left="720" w:hanging="360"/>
+      </w:pPr>
+      <w:r>
+        <w:rPr>
+          <w:rFonts w:ascii="Calibri" w:hAnsi="Calibri"/>
+          <w:sz w:val="20"/>
+        </w:rPr>
+        <w:t>Signed PII-free receipts record reviewed spans and build identity without storing source values or placeholders.</w:t>
+      </w:r>
+    </w:p>
+    <w:p>
+      <w:pPr>
+        <w:pStyle w:val="ListBullet"/>
+        <w:spacing w:after="60" w:line="259" w:lineRule="auto"/>
+        <w:ind w:left="720" w:hanging="360"/>
+      </w:pPr>
+      <w:r>
+        <w:rPr>
+          <w:rFonts w:ascii="Calibri" w:hAnsi="Calibri"/>
+          <w:sz w:val="20"/>
+        </w:rPr>
+        <w:t>A detached blind-review bundle and pre-registered thresholds exist; no independent labels have been collected yet.</w:t>
       </w:r>
     </w:p>
     <w:p>
@@ -1071,7 +1113,7 @@
     </w:p>
     <w:p>
       <w:r>
-        <w:t>Use the project as a demonstrator and dry-run inspection tool. Do not use READY_FOR_REVIEW as automatic authorization for high-risk documents. The Gosha flag remains off. The next evidence should come from independent human review on a versioned synthetic set and explicit acceptance thresholds.</w:t>
+        <w:t>Use the project as a demonstrator and dry-run inspection tool. Do not use READY_FOR_REVIEW as automatic authorization for high-risk documents. The Gosha flag remains off. The next evidence should come from independent human review on a versioned synthetic set and the already registered acceptance thresholds.</w:t>
       </w:r>
     </w:p>
     <w:sectPr>

</xml_diff>

<commit_message>
Drop the manual page breaks that left a blank page
Two sections were separated by explicit page breaks that were no longer
needed once the tables stopped splitting mid-row, and one of them landed
on a page that was already exactly full, so the break itself produced an
empty page 5. Sections now start a page through the heading's
page-break-before property, which does not leave that artifact.

RU and EN are 9 pages each; every page was rendered and checked.

Co-Authored-By: Claude Fable 5 <noreply@anthropic.com>
</commit_message>
<xml_diff>
--- a/docs/submission/pii-airlock-case-study.en.docx
+++ b/docs/submission/pii-airlock-case-study.en.docx
@@ -224,13 +224,9 @@
       </w:r>
     </w:p>
     <w:p>
-      <w:r>
-        <w:br w:type="page"/>
-      </w:r>
-    </w:p>
-    <w:p>
       <w:pPr>
         <w:pStyle w:val="Heading1"/>
+        <w:pageBreakBefore/>
       </w:pPr>
       <w:r>
         <w:t>2. Target result</w:t>
@@ -1250,11 +1246,6 @@
       </w:r>
     </w:p>
     <w:p>
-      <w:r>
-        <w:br w:type="page"/>
-      </w:r>
-    </w:p>
-    <w:p>
       <w:pPr>
         <w:pStyle w:val="Heading1"/>
       </w:pPr>
@@ -1551,11 +1542,6 @@
           <w:sz w:val="19"/>
         </w:rPr>
         <w:t>possible_secret_exfiltration_request — reveal the system prompt, return the key, print the password.</w:t>
-      </w:r>
-    </w:p>
-    <w:p>
-      <w:r>
-        <w:br w:type="page"/>
       </w:r>
     </w:p>
     <w:p>
@@ -2256,13 +2242,9 @@
       </w:r>
     </w:p>
     <w:p>
-      <w:r>
-        <w:br w:type="page"/>
-      </w:r>
-    </w:p>
-    <w:p>
       <w:pPr>
         <w:pStyle w:val="Heading1"/>
+        <w:pageBreakBefore/>
       </w:pPr>
       <w:r>
         <w:t>6. Risks</w:t>
@@ -3051,13 +3033,9 @@
       </w:tr>
     </w:tbl>
     <w:p>
-      <w:r>
-        <w:br w:type="page"/>
-      </w:r>
-    </w:p>
-    <w:p>
       <w:pPr>
         <w:pStyle w:val="Heading1"/>
+        <w:pageBreakBefore/>
       </w:pPr>
       <w:r>
         <w:t>7. Result</w:t>
@@ -3140,13 +3118,9 @@
       </w:r>
     </w:p>
     <w:p>
-      <w:r>
-        <w:br w:type="page"/>
-      </w:r>
-    </w:p>
-    <w:p>
       <w:pPr>
         <w:pStyle w:val="Heading2"/>
+        <w:pageBreakBefore/>
       </w:pPr>
       <w:r>
         <w:t>The UI: an instruction-hijack attempt</w:t>

</xml_diff>

<commit_message>
Drop the manual page breaks that left a blank page (#12)
Two sections were separated by explicit page breaks that were no longer
needed once the tables stopped splitting mid-row, and one of them landed
on a page that was already exactly full, so the break itself produced an
empty page 5. Sections now start a page through the heading's
page-break-before property, which does not leave that artifact.

RU and EN are 9 pages each; every page was rendered and checked.

Co-authored-by: AI-Danil <275346581+AI-Danil@users.noreply.github.com>
Co-authored-by: Claude Fable 5 <noreply@anthropic.com>
</commit_message>
<xml_diff>
--- a/docs/submission/pii-airlock-case-study.en.docx
+++ b/docs/submission/pii-airlock-case-study.en.docx
@@ -224,13 +224,9 @@
       </w:r>
     </w:p>
     <w:p>
-      <w:r>
-        <w:br w:type="page"/>
-      </w:r>
-    </w:p>
-    <w:p>
       <w:pPr>
         <w:pStyle w:val="Heading1"/>
+        <w:pageBreakBefore/>
       </w:pPr>
       <w:r>
         <w:t>2. Target result</w:t>
@@ -1250,11 +1246,6 @@
       </w:r>
     </w:p>
     <w:p>
-      <w:r>
-        <w:br w:type="page"/>
-      </w:r>
-    </w:p>
-    <w:p>
       <w:pPr>
         <w:pStyle w:val="Heading1"/>
       </w:pPr>
@@ -1551,11 +1542,6 @@
           <w:sz w:val="19"/>
         </w:rPr>
         <w:t>possible_secret_exfiltration_request — reveal the system prompt, return the key, print the password.</w:t>
-      </w:r>
-    </w:p>
-    <w:p>
-      <w:r>
-        <w:br w:type="page"/>
       </w:r>
     </w:p>
     <w:p>
@@ -2256,13 +2242,9 @@
       </w:r>
     </w:p>
     <w:p>
-      <w:r>
-        <w:br w:type="page"/>
-      </w:r>
-    </w:p>
-    <w:p>
       <w:pPr>
         <w:pStyle w:val="Heading1"/>
+        <w:pageBreakBefore/>
       </w:pPr>
       <w:r>
         <w:t>6. Risks</w:t>
@@ -3051,13 +3033,9 @@
       </w:tr>
     </w:tbl>
     <w:p>
-      <w:r>
-        <w:br w:type="page"/>
-      </w:r>
-    </w:p>
-    <w:p>
       <w:pPr>
         <w:pStyle w:val="Heading1"/>
+        <w:pageBreakBefore/>
       </w:pPr>
       <w:r>
         <w:t>7. Result</w:t>
@@ -3140,13 +3118,9 @@
       </w:r>
     </w:p>
     <w:p>
-      <w:r>
-        <w:br w:type="page"/>
-      </w:r>
-    </w:p>
-    <w:p>
       <w:pPr>
         <w:pStyle w:val="Heading2"/>
+        <w:pageBreakBefore/>
       </w:pPr>
       <w:r>
         <w:t>The UI: an instruction-hijack attempt</w:t>

</xml_diff>